<commit_message>
docs(project-2): move proposal cloud design to AWS
The team will build and run Project 2 entirely on AWS. Replace the
Alibaba Cloud hosting with EC2 (Docker Compose), RDS for PostgreSQL,
private S3 buckets, ECR, SSM Parameter Store and Run Command,
CloudWatch, AWS Budgets and Terraform-defined resources, with GitHub
Actions deploying through an OIDC role.

Update the decisions, security controls, effort, risks and the
deployment diagram to match.
</commit_message>
<xml_diff>
--- a/docs/project-2-proposal.docx
+++ b/docs/project-2-proposal.docx
@@ -213,7 +213,7 @@
         <w:pStyle w:val="FirstParagraph"/>
       </w:pPr>
       <w:r>
-        <w:t xml:space="preserve">FlickPond is a video application built in Project 1. Users register, upload their own videos, and FlickPond converts each upload into MP4 and adaptive HLS streams (360p, 480p and 720p) with FFmpeg workers. Owners then follow the job status and play the result through a signed, owner-checked link. The system runs on FastAPI, PostgreSQL, Redis with RQ, MinIO object storage, nginx and a browser frontend, and it was deployed with TLS on Alibaba Cloud.</w:t>
+        <w:t xml:space="preserve">FlickPond is a video application built in Project 1. Users register, upload their own videos, and FlickPond converts each upload into MP4 and adaptive HLS streams (360p, 480p and 720p) with FFmpeg workers. Owners then follow the job status and play the result through a signed, owner-checked link. The system runs on FastAPI, PostgreSQL, Redis with RQ, MinIO object storage, nginx and a browser frontend, deployed with TLS on a single cloud virtual machine.</w:t>
       </w:r>
     </w:p>
     <w:p>
@@ -1885,7 +1885,7 @@
               <w:t xml:space="preserve"> </w:t>
             </w:r>
             <w:r>
-              <w:t xml:space="preserve">on one PostgreSQL server: separate databases, roles and migration histories</w:t>
+              <w:t xml:space="preserve">on one Amazon RDS for PostgreSQL instance: separate databases, roles and migration histories</w:t>
             </w:r>
           </w:p>
         </w:tc>
@@ -2200,48 +2200,154 @@
                 <w:b/>
                 <w:bCs/>
               </w:rPr>
-              <w:t xml:space="preserve">One cloud VM with Docker Compose</w:t>
+              <w:t xml:space="preserve">Run the services on one Amazon EC2 instance with Docker Compose</w:t>
+            </w:r>
+            <w:r>
+              <w:t xml:space="preserve">, worker replicas capped at 2 vCPU each</w:t>
+            </w:r>
+          </w:p>
+        </w:tc>
+        <w:tc>
+          <w:tcPr/>
+          <w:p>
+            <w:pPr>
+              <w:pStyle w:val="Compact"/>
+            </w:pPr>
+            <w:r>
+              <w:t xml:space="preserve">Low cost, reuses the team’s existing Compose tooling, and gives a fair and repeatable scaling experiment</w:t>
+            </w:r>
+          </w:p>
+        </w:tc>
+        <w:tc>
+          <w:tcPr/>
+          <w:p>
+            <w:pPr>
+              <w:pStyle w:val="Compact"/>
+            </w:pPr>
+            <w:r>
+              <w:t xml:space="preserve">Amazon ECS on Fargate or EKS: better for production scaling, but adds operational work outside the project’s focus</w:t>
+            </w:r>
+          </w:p>
+        </w:tc>
+      </w:tr>
+      <w:tr>
+        <w:tc>
+          <w:tcPr/>
+          <w:p>
+            <w:pPr>
+              <w:pStyle w:val="Compact"/>
+            </w:pPr>
+            <w:r>
+              <w:t xml:space="preserve">AD-08</w:t>
+            </w:r>
+          </w:p>
+        </w:tc>
+        <w:tc>
+          <w:tcPr/>
+          <w:p>
+            <w:pPr>
+              <w:pStyle w:val="Compact"/>
+            </w:pPr>
+            <w:r>
+              <w:rPr>
+                <w:b/>
+                <w:bCs/>
+              </w:rPr>
+              <w:t xml:space="preserve">Use AWS managed services for state and operations</w:t>
+            </w:r>
+            <w:r>
+              <w:t xml:space="preserve">: RDS for PostgreSQL, S3, ECR, SSM Parameter Store and CloudWatch</w:t>
+            </w:r>
+          </w:p>
+        </w:tc>
+        <w:tc>
+          <w:tcPr/>
+          <w:p>
+            <w:pPr>
+              <w:pStyle w:val="Compact"/>
+            </w:pPr>
+            <w:r>
+              <w:t xml:space="preserve">No database or storage server to run; S3 presigned URLs and bucket policies give least-privilege media access natively; managed backups and metrics</w:t>
+            </w:r>
+          </w:p>
+        </w:tc>
+        <w:tc>
+          <w:tcPr/>
+          <w:p>
+            <w:pPr>
+              <w:pStyle w:val="Compact"/>
+            </w:pPr>
+            <w:r>
+              <w:t xml:space="preserve">Self-hosting PostgreSQL and MinIO on the instance: cheaper, but more operational work and weaker isolation</w:t>
+            </w:r>
+          </w:p>
+        </w:tc>
+      </w:tr>
+      <w:tr>
+        <w:tc>
+          <w:tcPr/>
+          <w:p>
+            <w:pPr>
+              <w:pStyle w:val="Compact"/>
+            </w:pPr>
+            <w:r>
+              <w:t xml:space="preserve">AD-09</w:t>
+            </w:r>
+          </w:p>
+        </w:tc>
+        <w:tc>
+          <w:tcPr/>
+          <w:p>
+            <w:pPr>
+              <w:pStyle w:val="Compact"/>
+            </w:pPr>
+            <w:r>
+              <w:rPr>
+                <w:b/>
+                <w:bCs/>
+              </w:rPr>
+              <w:t xml:space="preserve">Define the AWS resources in Terraform</w:t>
             </w:r>
             <w:r>
               <w:t xml:space="preserve"> </w:t>
             </w:r>
             <w:r>
-              <w:t xml:space="preserve">and worker replicas capped at 2 vCPU each</w:t>
-            </w:r>
-          </w:p>
-        </w:tc>
-        <w:tc>
-          <w:tcPr/>
-          <w:p>
-            <w:pPr>
-              <w:pStyle w:val="Compact"/>
-            </w:pPr>
-            <w:r>
-              <w:t xml:space="preserve">Low cost, reuses the team’s existing tooling, and gives a fair and repeatable scaling experiment</w:t>
-            </w:r>
-          </w:p>
-        </w:tc>
-        <w:tc>
-          <w:tcPr/>
-          <w:p>
-            <w:pPr>
-              <w:pStyle w:val="Compact"/>
-            </w:pPr>
-            <w:r>
-              <w:t xml:space="preserve">Kubernetes / managed container service: operational overhead outside the project’s focus</w:t>
-            </w:r>
-          </w:p>
-        </w:tc>
-      </w:tr>
-      <w:tr>
-        <w:tc>
-          <w:tcPr/>
-          <w:p>
-            <w:pPr>
-              <w:pStyle w:val="Compact"/>
-            </w:pPr>
-            <w:r>
-              <w:t xml:space="preserve">AD-08</w:t>
+              <w:t xml:space="preserve">(VPC, security groups, EC2, RDS, S3, ECR, IAM)</w:t>
+            </w:r>
+          </w:p>
+        </w:tc>
+        <w:tc>
+          <w:tcPr/>
+          <w:p>
+            <w:pPr>
+              <w:pStyle w:val="Compact"/>
+            </w:pPr>
+            <w:r>
+              <w:t xml:space="preserve">The environment can be recreated and reviewed like code; changes go through pull requests</w:t>
+            </w:r>
+          </w:p>
+        </w:tc>
+        <w:tc>
+          <w:tcPr/>
+          <w:p>
+            <w:pPr>
+              <w:pStyle w:val="Compact"/>
+            </w:pPr>
+            <w:r>
+              <w:t xml:space="preserve">Console set-up: faster at first, but not repeatable or reviewable</w:t>
+            </w:r>
+          </w:p>
+        </w:tc>
+      </w:tr>
+      <w:tr>
+        <w:tc>
+          <w:tcPr/>
+          <w:p>
+            <w:pPr>
+              <w:pStyle w:val="Compact"/>
+            </w:pPr>
+            <w:r>
+              <w:t xml:space="preserve">AD-10</w:t>
             </w:r>
           </w:p>
         </w:tc>
@@ -2301,7 +2407,7 @@
       <w:r>
         <w:drawing>
           <wp:inline>
-            <wp:extent cx="5334000" cy="2880360"/>
+            <wp:extent cx="5334000" cy="3200400"/>
             <wp:effectExtent b="0" l="0" r="0" t="0"/>
             <wp:docPr descr="Figure 4. Delivery pipeline and cloud deployment" title="" id="28" name="Picture"/>
             <a:graphic>
@@ -2322,7 +2428,7 @@
                   <pic:spPr bwMode="auto">
                     <a:xfrm>
                       <a:off x="0" y="0"/>
-                      <a:ext cx="5334000" cy="2880360"/>
+                      <a:ext cx="5334000" cy="3200400"/>
                     </a:xfrm>
                     <a:prstGeom prst="rect">
                       <a:avLst/>
@@ -2350,7 +2456,7 @@
           <w:i/>
           <w:iCs/>
         </w:rPr>
-        <w:t xml:space="preserve">Figure 4. Every change passes the GitHub Actions pipeline. Versioned images are deployed per service to one cloud VM, where only HTTPS is exposed. Databases, the queue and storage stay on the private network.</w:t>
+        <w:t xml:space="preserve">Figure 4. Every change passes the GitHub Actions pipeline. Images are pushed to Amazon ECR and deployed per service to an EC2 instance through AWS Systems Manager. Only HTTPS is exposed; RDS sits in a private subnet and S3 buckets are private.</w:t>
       </w:r>
     </w:p>
     <w:p>
@@ -2358,7 +2464,7 @@
         <w:pStyle w:val="BodyText"/>
       </w:pPr>
       <w:r>
-        <w:t xml:space="preserve">We will host the demonstration on a</w:t>
+        <w:t xml:space="preserve">The whole platform runs on</w:t>
       </w:r>
       <w:r>
         <w:t xml:space="preserve"> </w:t>
@@ -2368,18 +2474,379 @@
           <w:b/>
           <w:bCs/>
         </w:rPr>
-        <w:t xml:space="preserve">separate Alibaba Cloud ECS instance in Singapore</w:t>
-      </w:r>
-      <w:r>
-        <w:t xml:space="preserve">, not the shared Project 1 deployment. Alibaba Cloud is the provider the team already used in Project 1. Development uses 4 vCPU / 8 GiB. For the scaling experiment, the instance is temporarily resized to 8 vCPU / 16 GiB so that three 2-vCPU workers have room alongside the other services. The instance is stopped outside work and test sessions, and the target cloud budget is under S$100 for the project.</w:t>
-      </w:r>
-    </w:p>
+        <w:t xml:space="preserve">AWS in the Singapore region (ap-southeast-1)</w:t>
+      </w:r>
+      <w:r>
+        <w:t xml:space="preserve">:</w:t>
+      </w:r>
+    </w:p>
+    <w:tbl>
+      <w:tblPr>
+        <w:tblStyle w:val="Table"/>
+        <w:tblW w:type="pct" w:w="5000"/>
+        <w:tblLayout w:type="fixed"/>
+        <w:tblLook w:firstRow="1" w:lastRow="0" w:firstColumn="0" w:lastColumn="0" w:noHBand="0" w:noVBand="0" w:val="0020"/>
+      </w:tblPr>
+      <w:tblGrid>
+        <w:gridCol w:w="1277"/>
+        <w:gridCol w:w="1532"/>
+        <w:gridCol w:w="5109"/>
+      </w:tblGrid>
+      <w:tr>
+        <w:trPr>
+          <w:tblHeader w:val="on"/>
+        </w:trPr>
+        <w:tc>
+          <w:tcPr/>
+          <w:p>
+            <w:pPr>
+              <w:pStyle w:val="Compact"/>
+            </w:pPr>
+            <w:r>
+              <w:t xml:space="preserve">Need</w:t>
+            </w:r>
+          </w:p>
+        </w:tc>
+        <w:tc>
+          <w:tcPr/>
+          <w:p>
+            <w:pPr>
+              <w:pStyle w:val="Compact"/>
+            </w:pPr>
+            <w:r>
+              <w:t xml:space="preserve">AWS service</w:t>
+            </w:r>
+          </w:p>
+        </w:tc>
+        <w:tc>
+          <w:tcPr/>
+          <w:p>
+            <w:pPr>
+              <w:pStyle w:val="Compact"/>
+            </w:pPr>
+            <w:r>
+              <w:t xml:space="preserve">How we use it</w:t>
+            </w:r>
+          </w:p>
+        </w:tc>
+      </w:tr>
+      <w:tr>
+        <w:tc>
+          <w:tcPr/>
+          <w:p>
+            <w:pPr>
+              <w:pStyle w:val="Compact"/>
+            </w:pPr>
+            <w:r>
+              <w:t xml:space="preserve">Compute</w:t>
+            </w:r>
+          </w:p>
+        </w:tc>
+        <w:tc>
+          <w:tcPr/>
+          <w:p>
+            <w:pPr>
+              <w:pStyle w:val="Compact"/>
+            </w:pPr>
+            <w:r>
+              <w:t xml:space="preserve">Amazon EC2</w:t>
+            </w:r>
+          </w:p>
+        </w:tc>
+        <w:tc>
+          <w:tcPr/>
+          <w:p>
+            <w:pPr>
+              <w:pStyle w:val="Compact"/>
+            </w:pPr>
+            <w:r>
+              <w:t xml:space="preserve">One instance runs ingress, both service APIs, Redis, the workers and the recovery task with Docker Compose. 4 vCPU / 8 GiB for development; resized to 8 vCPU / 16 GiB for the scaling experiment so three 2-vCPU workers have room</w:t>
+            </w:r>
+          </w:p>
+        </w:tc>
+      </w:tr>
+      <w:tr>
+        <w:tc>
+          <w:tcPr/>
+          <w:p>
+            <w:pPr>
+              <w:pStyle w:val="Compact"/>
+            </w:pPr>
+            <w:r>
+              <w:t xml:space="preserve">Relational data</w:t>
+            </w:r>
+          </w:p>
+        </w:tc>
+        <w:tc>
+          <w:tcPr/>
+          <w:p>
+            <w:pPr>
+              <w:pStyle w:val="Compact"/>
+            </w:pPr>
+            <w:r>
+              <w:t xml:space="preserve">Amazon RDS for PostgreSQL</w:t>
+            </w:r>
+          </w:p>
+        </w:tc>
+        <w:tc>
+          <w:tcPr/>
+          <w:p>
+            <w:pPr>
+              <w:pStyle w:val="Compact"/>
+            </w:pPr>
+            <w:r>
+              <w:t xml:space="preserve">Single-AZ instance in a private subnet holding</w:t>
+            </w:r>
+            <w:r>
+              <w:t xml:space="preserve"> </w:t>
+            </w:r>
+            <w:r>
+              <w:rPr>
+                <w:rStyle w:val="VerbatimChar"/>
+              </w:rPr>
+              <w:t xml:space="preserve">media_db</w:t>
+            </w:r>
+            <w:r>
+              <w:t xml:space="preserve"> </w:t>
+            </w:r>
+            <w:r>
+              <w:t xml:space="preserve">and</w:t>
+            </w:r>
+            <w:r>
+              <w:t xml:space="preserve"> </w:t>
+            </w:r>
+            <w:r>
+              <w:rPr>
+                <w:rStyle w:val="VerbatimChar"/>
+              </w:rPr>
+              <w:t xml:space="preserve">processing_db</w:t>
+            </w:r>
+            <w:r>
+              <w:t xml:space="preserve">, each with its own role</w:t>
+            </w:r>
+          </w:p>
+        </w:tc>
+      </w:tr>
+      <w:tr>
+        <w:tc>
+          <w:tcPr/>
+          <w:p>
+            <w:pPr>
+              <w:pStyle w:val="Compact"/>
+            </w:pPr>
+            <w:r>
+              <w:t xml:space="preserve">Media files</w:t>
+            </w:r>
+          </w:p>
+        </w:tc>
+        <w:tc>
+          <w:tcPr/>
+          <w:p>
+            <w:pPr>
+              <w:pStyle w:val="Compact"/>
+            </w:pPr>
+            <w:r>
+              <w:t xml:space="preserve">Amazon S3</w:t>
+            </w:r>
+          </w:p>
+        </w:tc>
+        <w:tc>
+          <w:tcPr/>
+          <w:p>
+            <w:pPr>
+              <w:pStyle w:val="Compact"/>
+            </w:pPr>
+            <w:r>
+              <w:t xml:space="preserve">Private, encrypted</w:t>
+            </w:r>
+            <w:r>
+              <w:t xml:space="preserve"> </w:t>
+            </w:r>
+            <w:r>
+              <w:rPr>
+                <w:rStyle w:val="VerbatimChar"/>
+              </w:rPr>
+              <w:t xml:space="preserve">sources</w:t>
+            </w:r>
+            <w:r>
+              <w:t xml:space="preserve"> </w:t>
+            </w:r>
+            <w:r>
+              <w:t xml:space="preserve">and</w:t>
+            </w:r>
+            <w:r>
+              <w:t xml:space="preserve"> </w:t>
+            </w:r>
+            <w:r>
+              <w:rPr>
+                <w:rStyle w:val="VerbatimChar"/>
+              </w:rPr>
+              <w:t xml:space="preserve">outputs</w:t>
+            </w:r>
+            <w:r>
+              <w:t xml:space="preserve"> </w:t>
+            </w:r>
+            <w:r>
+              <w:t xml:space="preserve">buckets with Block Public Access; access only through presigned URLs</w:t>
+            </w:r>
+          </w:p>
+        </w:tc>
+      </w:tr>
+      <w:tr>
+        <w:tc>
+          <w:tcPr/>
+          <w:p>
+            <w:pPr>
+              <w:pStyle w:val="Compact"/>
+            </w:pPr>
+            <w:r>
+              <w:t xml:space="preserve">Images</w:t>
+            </w:r>
+          </w:p>
+        </w:tc>
+        <w:tc>
+          <w:tcPr/>
+          <w:p>
+            <w:pPr>
+              <w:pStyle w:val="Compact"/>
+            </w:pPr>
+            <w:r>
+              <w:t xml:space="preserve">Amazon ECR</w:t>
+            </w:r>
+          </w:p>
+        </w:tc>
+        <w:tc>
+          <w:tcPr/>
+          <w:p>
+            <w:pPr>
+              <w:pStyle w:val="Compact"/>
+            </w:pPr>
+            <w:r>
+              <w:t xml:space="preserve">One repository per service; images tagged with the commit SHA</w:t>
+            </w:r>
+          </w:p>
+        </w:tc>
+      </w:tr>
+      <w:tr>
+        <w:tc>
+          <w:tcPr/>
+          <w:p>
+            <w:pPr>
+              <w:pStyle w:val="Compact"/>
+            </w:pPr>
+            <w:r>
+              <w:t xml:space="preserve">Secrets</w:t>
+            </w:r>
+          </w:p>
+        </w:tc>
+        <w:tc>
+          <w:tcPr/>
+          <w:p>
+            <w:pPr>
+              <w:pStyle w:val="Compact"/>
+            </w:pPr>
+            <w:r>
+              <w:t xml:space="preserve">SSM Parameter Store</w:t>
+            </w:r>
+          </w:p>
+        </w:tc>
+        <w:tc>
+          <w:tcPr/>
+          <w:p>
+            <w:pPr>
+              <w:pStyle w:val="Compact"/>
+            </w:pPr>
+            <w:r>
+              <w:t xml:space="preserve">Service token, database passwords and JWT signing key as SecureString parameters</w:t>
+            </w:r>
+          </w:p>
+        </w:tc>
+      </w:tr>
+      <w:tr>
+        <w:tc>
+          <w:tcPr/>
+          <w:p>
+            <w:pPr>
+              <w:pStyle w:val="Compact"/>
+            </w:pPr>
+            <w:r>
+              <w:t xml:space="preserve">Deployment access</w:t>
+            </w:r>
+          </w:p>
+        </w:tc>
+        <w:tc>
+          <w:tcPr/>
+          <w:p>
+            <w:pPr>
+              <w:pStyle w:val="Compact"/>
+            </w:pPr>
+            <w:r>
+              <w:t xml:space="preserve">IAM + SSM</w:t>
+            </w:r>
+          </w:p>
+        </w:tc>
+        <w:tc>
+          <w:tcPr/>
+          <w:p>
+            <w:pPr>
+              <w:pStyle w:val="Compact"/>
+            </w:pPr>
+            <w:r>
+              <w:t xml:space="preserve">GitHub Actions assumes a deploy role through OIDC (no stored access keys) and deploys with SSM Run Command; no SSH port is open</w:t>
+            </w:r>
+          </w:p>
+        </w:tc>
+      </w:tr>
+      <w:tr>
+        <w:tc>
+          <w:tcPr/>
+          <w:p>
+            <w:pPr>
+              <w:pStyle w:val="Compact"/>
+            </w:pPr>
+            <w:r>
+              <w:t xml:space="preserve">Observability and cost</w:t>
+            </w:r>
+          </w:p>
+        </w:tc>
+        <w:tc>
+          <w:tcPr/>
+          <w:p>
+            <w:pPr>
+              <w:pStyle w:val="Compact"/>
+            </w:pPr>
+            <w:r>
+              <w:t xml:space="preserve">CloudWatch, AWS Budgets</w:t>
+            </w:r>
+          </w:p>
+        </w:tc>
+        <w:tc>
+          <w:tcPr/>
+          <w:p>
+            <w:pPr>
+              <w:pStyle w:val="Compact"/>
+            </w:pPr>
+            <w:r>
+              <w:t xml:space="preserve">Container logs and CPU/memory metrics for the experiments; budget alerts at 50% and 80%</w:t>
+            </w:r>
+          </w:p>
+        </w:tc>
+      </w:tr>
+    </w:tbl>
     <w:p>
       <w:pPr>
         <w:pStyle w:val="BodyText"/>
       </w:pPr>
       <w:r>
-        <w:t xml:space="preserve">The same Compose files run locally and in the cloud, so every scenario can be reproduced on a developer machine before it is run in the cloud.</w:t>
+        <w:t xml:space="preserve">All resources are defined in Terraform. The EC2 and RDS instances are stopped outside work and test sessions, and the target AWS spend is under US$100 for the project.</w:t>
+      </w:r>
+    </w:p>
+    <w:p>
+      <w:pPr>
+        <w:pStyle w:val="BodyText"/>
+      </w:pPr>
+      <w:r>
+        <w:t xml:space="preserve">The same images also run locally with Docker Compose, using PostgreSQL and MinIO containers (MinIO speaks the S3 API) in place of RDS and S3, so every scenario can be reproduced on a developer machine before it runs on AWS.</w:t>
       </w:r>
     </w:p>
     <w:p>
@@ -2673,9 +3140,9 @@
         <w:tblLook w:firstRow="1" w:lastRow="0" w:firstColumn="0" w:lastColumn="0" w:noHBand="0" w:noVBand="0" w:val="0020"/>
       </w:tblPr>
       <w:tblGrid>
-        <w:gridCol w:w="432"/>
-        <w:gridCol w:w="6048"/>
-        <w:gridCol w:w="1440"/>
+        <w:gridCol w:w="819"/>
+        <w:gridCol w:w="5735"/>
+        <w:gridCol w:w="1365"/>
       </w:tblGrid>
       <w:tr>
         <w:trPr>
@@ -3138,7 +3605,7 @@
         </w:numPr>
       </w:pPr>
       <w:r>
-        <w:t xml:space="preserve">Services are packaged as immutable, versioned containers.</w:t>
+        <w:t xml:space="preserve">Services are packaged as immutable, versioned containers stored in Amazon ECR.</w:t>
       </w:r>
     </w:p>
     <w:p>
@@ -3150,7 +3617,7 @@
         </w:numPr>
       </w:pPr>
       <w:r>
-        <w:t xml:space="preserve">APIs and workers are stateless; durable state lives in PostgreSQL and object storage.</w:t>
+        <w:t xml:space="preserve">APIs and workers are stateless; durable state lives in managed services (RDS and S3).</w:t>
       </w:r>
     </w:p>
     <w:p>
@@ -3162,7 +3629,7 @@
         </w:numPr>
       </w:pPr>
       <w:r>
-        <w:t xml:space="preserve">Configuration and secrets are kept outside the images.</w:t>
+        <w:t xml:space="preserve">Configuration and secrets are kept outside the images, in SSM Parameter Store.</w:t>
       </w:r>
     </w:p>
     <w:p>
@@ -3174,7 +3641,7 @@
         </w:numPr>
       </w:pPr>
       <w:r>
-        <w:t xml:space="preserve">Health checks drive the deployment.</w:t>
+        <w:t xml:space="preserve">The environment is defined in Terraform and can be recreated from code.</w:t>
       </w:r>
     </w:p>
     <w:p>
@@ -3186,7 +3653,7 @@
         </w:numPr>
       </w:pPr>
       <w:r>
-        <w:t xml:space="preserve">Workers are disposable: interrupted jobs are reconciled rather than lost.</w:t>
+        <w:t xml:space="preserve">Health checks drive the deployment.</w:t>
       </w:r>
     </w:p>
     <w:p>
@@ -3198,6 +3665,18 @@
         </w:numPr>
       </w:pPr>
       <w:r>
+        <w:t xml:space="preserve">Workers are disposable: interrupted jobs are reconciled rather than lost.</w:t>
+      </w:r>
+    </w:p>
+    <w:p>
+      <w:pPr>
+        <w:pStyle w:val="Compact"/>
+        <w:numPr>
+          <w:ilvl w:val="0"/>
+          <w:numId w:val="1005"/>
+        </w:numPr>
+      </w:pPr>
+      <w:r>
         <w:t xml:space="preserve">Each service is released independently, with no change to the other service.</w:t>
       </w:r>
     </w:p>
@@ -3355,7 +3834,7 @@
         </w:numPr>
       </w:pPr>
       <w:r>
-        <w:t xml:space="preserve">We will fix the known fixable HIGH finding in the inherited image and the MinIO setup issue on fresh machines in week 1.</w:t>
+        <w:t xml:space="preserve">We will fix the known fixable HIGH finding in the inherited image in week 1.</w:t>
       </w:r>
     </w:p>
     <w:p>
@@ -3528,18 +4007,18 @@
               <w:pStyle w:val="Compact"/>
             </w:pPr>
             <w:r>
-              <w:t xml:space="preserve">Presigned, time-limited storage URLs; private buckets</w:t>
-            </w:r>
-          </w:p>
-        </w:tc>
-        <w:tc>
-          <w:tcPr/>
-          <w:p>
-            <w:pPr>
-              <w:pStyle w:val="Compact"/>
-            </w:pPr>
-            <w:r>
-              <w:t xml:space="preserve">Expired and tampered URLs fail; no public bucket listing</w:t>
+              <w:t xml:space="preserve">Presigned, time-limited S3 URLs; private buckets with Block Public Access; each service’s IAM role reaches only its own bucket</w:t>
+            </w:r>
+          </w:p>
+        </w:tc>
+        <w:tc>
+          <w:tcPr/>
+          <w:p>
+            <w:pPr>
+              <w:pStyle w:val="Compact"/>
+            </w:pPr>
+            <w:r>
+              <w:t xml:space="preserve">Expired and tampered URLs fail; no public bucket listing; each role is denied on the other bucket</w:t>
             </w:r>
           </w:p>
         </w:tc>
@@ -3576,18 +4055,42 @@
               <w:pStyle w:val="Compact"/>
             </w:pPr>
             <w:r>
-              <w:t xml:space="preserve">Only port 443 exposed; secrets in Compose secrets, never in git</w:t>
-            </w:r>
-          </w:p>
-        </w:tc>
-        <w:tc>
-          <w:tcPr/>
-          <w:p>
-            <w:pPr>
-              <w:pStyle w:val="Compact"/>
-            </w:pPr>
-            <w:r>
-              <w:t xml:space="preserve">External port scan; secret scanning in CI</w:t>
+              <w:t xml:space="preserve">Security groups expose only 443 (and 80 for certificate renewal); RDS accepts connections only from the EC2 security group; no SSH</w:t>
+            </w:r>
+          </w:p>
+        </w:tc>
+        <w:tc>
+          <w:tcPr/>
+          <w:p>
+            <w:pPr>
+              <w:pStyle w:val="Compact"/>
+            </w:pPr>
+            <w:r>
+              <w:t xml:space="preserve">External port scan; RDS unreachable from the internet</w:t>
+            </w:r>
+          </w:p>
+        </w:tc>
+      </w:tr>
+      <w:tr>
+        <w:tc>
+          <w:tcPr/>
+          <w:p>
+            <w:pPr>
+              <w:pStyle w:val="Compact"/>
+            </w:pPr>
+            <w:r>
+              <w:t xml:space="preserve">Secrets in SSM Parameter Store; GitHub Actions uses short-lived OIDC credentials</w:t>
+            </w:r>
+          </w:p>
+        </w:tc>
+        <w:tc>
+          <w:tcPr/>
+          <w:p>
+            <w:pPr>
+              <w:pStyle w:val="Compact"/>
+            </w:pPr>
+            <w:r>
+              <w:t xml:space="preserve">No secrets in git or images (secret scanning in CI); no long-lived AWS keys exist</w:t>
             </w:r>
           </w:p>
         </w:tc>
@@ -4081,7 +4584,7 @@
         </w:numPr>
       </w:pPr>
       <w:r>
-        <w:t xml:space="preserve">Kubernetes, autoscaling, multi-host or multi-zone failover, and migration to another cloud provider.</w:t>
+        <w:t xml:space="preserve">Kubernetes (EKS), ECS/Fargate, Auto Scaling groups, and multi-AZ or multi-region failover.</w:t>
       </w:r>
     </w:p>
     <w:p>
@@ -4283,7 +4786,7 @@
               <w:pStyle w:val="Compact"/>
             </w:pPr>
             <w:r>
-              <w:t xml:space="preserve">Independent release and scaling, disposable workers with recoverable state, and automated, gated delivery (§2.5, §3.3)</w:t>
+              <w:t xml:space="preserve">Independent release and scaling, disposable workers with recoverable state, managed AWS data services, infrastructure as code, and automated, gated delivery (§2.5, §3.3)</w:t>
             </w:r>
           </w:p>
         </w:tc>
@@ -4422,7 +4925,7 @@
               <w:pStyle w:val="Compact"/>
             </w:pPr>
             <w:r>
-              <w:t xml:space="preserve">Freeze baseline, reproducible local setup, fix the inherited scan and MinIO issues</w:t>
+              <w:t xml:space="preserve">Freeze baseline, reproducible local setup, fix the inherited scan finding</w:t>
             </w:r>
           </w:p>
         </w:tc>
@@ -4445,42 +4948,277 @@
               <w:jc w:val="right"/>
             </w:pPr>
             <w:r>
+              <w:t xml:space="preserve">1</w:t>
+            </w:r>
+          </w:p>
+        </w:tc>
+      </w:tr>
+      <w:tr>
+        <w:tc>
+          <w:tcPr/>
+          <w:p>
+            <w:pPr>
+              <w:pStyle w:val="Compact"/>
+            </w:pPr>
+            <w:r>
               <w:t xml:space="preserve">2</w:t>
             </w:r>
           </w:p>
         </w:tc>
-      </w:tr>
-      <w:tr>
-        <w:tc>
-          <w:tcPr/>
-          <w:p>
-            <w:pPr>
-              <w:pStyle w:val="Compact"/>
+        <w:tc>
+          <w:tcPr/>
+          <w:p>
+            <w:pPr>
+              <w:pStyle w:val="Compact"/>
+            </w:pPr>
+            <w:r>
+              <w:t xml:space="preserve">Domain analysis, service contracts and OpenAPI documents</w:t>
+            </w:r>
+          </w:p>
+        </w:tc>
+        <w:tc>
+          <w:tcPr/>
+          <w:p>
+            <w:pPr>
+              <w:pStyle w:val="Compact"/>
+            </w:pPr>
+            <w:r>
+              <w:t xml:space="preserve">Long (team review)</w:t>
+            </w:r>
+          </w:p>
+        </w:tc>
+        <w:tc>
+          <w:tcPr/>
+          <w:p>
+            <w:pPr>
+              <w:pStyle w:val="Compact"/>
+              <w:jc w:val="right"/>
+            </w:pPr>
+            <w:r>
+              <w:t xml:space="preserve">3</w:t>
+            </w:r>
+          </w:p>
+        </w:tc>
+      </w:tr>
+      <w:tr>
+        <w:tc>
+          <w:tcPr/>
+          <w:p>
+            <w:pPr>
+              <w:pStyle w:val="Compact"/>
+            </w:pPr>
+            <w:r>
+              <w:t xml:space="preserve">3</w:t>
+            </w:r>
+          </w:p>
+        </w:tc>
+        <w:tc>
+          <w:tcPr/>
+          <w:p>
+            <w:pPr>
+              <w:pStyle w:val="Compact"/>
+            </w:pPr>
+            <w:r>
+              <w:t xml:space="preserve">Extract Processing: service, own database and migrations, workers and recovery task</w:t>
+            </w:r>
+          </w:p>
+        </w:tc>
+        <w:tc>
+          <w:tcPr/>
+          <w:p>
+            <w:pPr>
+              <w:pStyle w:val="Compact"/>
+            </w:pPr>
+            <w:r>
+              <w:t xml:space="preserve">Ibrahim</w:t>
+            </w:r>
+          </w:p>
+        </w:tc>
+        <w:tc>
+          <w:tcPr/>
+          <w:p>
+            <w:pPr>
+              <w:pStyle w:val="Compact"/>
+              <w:jc w:val="right"/>
+            </w:pPr>
+            <w:r>
+              <w:t xml:space="preserve">6</w:t>
+            </w:r>
+          </w:p>
+        </w:tc>
+      </w:tr>
+      <w:tr>
+        <w:tc>
+          <w:tcPr/>
+          <w:p>
+            <w:pPr>
+              <w:pStyle w:val="Compact"/>
+            </w:pPr>
+            <w:r>
+              <w:t xml:space="preserve">4</w:t>
+            </w:r>
+          </w:p>
+        </w:tc>
+        <w:tc>
+          <w:tcPr/>
+          <w:p>
+            <w:pPr>
+              <w:pStyle w:val="Compact"/>
+            </w:pPr>
+            <w:r>
+              <w:t xml:space="preserve">Adapt Media Management: asset records, Processing client, web app routes and retry</w:t>
+            </w:r>
+          </w:p>
+        </w:tc>
+        <w:tc>
+          <w:tcPr/>
+          <w:p>
+            <w:pPr>
+              <w:pStyle w:val="Compact"/>
+            </w:pPr>
+            <w:r>
+              <w:t xml:space="preserve">Ibrahim</w:t>
+            </w:r>
+          </w:p>
+        </w:tc>
+        <w:tc>
+          <w:tcPr/>
+          <w:p>
+            <w:pPr>
+              <w:pStyle w:val="Compact"/>
+              <w:jc w:val="right"/>
+            </w:pPr>
+            <w:r>
+              <w:t xml:space="preserve">3</w:t>
+            </w:r>
+          </w:p>
+        </w:tc>
+      </w:tr>
+      <w:tr>
+        <w:tc>
+          <w:tcPr/>
+          <w:p>
+            <w:pPr>
+              <w:pStyle w:val="Compact"/>
+            </w:pPr>
+            <w:r>
+              <w:t xml:space="preserve">5</w:t>
+            </w:r>
+          </w:p>
+        </w:tc>
+        <w:tc>
+          <w:tcPr/>
+          <w:p>
+            <w:pPr>
+              <w:pStyle w:val="Compact"/>
+            </w:pPr>
+            <w:r>
+              <w:t xml:space="preserve">Boundary security: service token, owner checks, database roles, presigned URLs, negative tests</w:t>
+            </w:r>
+          </w:p>
+        </w:tc>
+        <w:tc>
+          <w:tcPr/>
+          <w:p>
+            <w:pPr>
+              <w:pStyle w:val="Compact"/>
+            </w:pPr>
+            <w:r>
+              <w:t xml:space="preserve">Guruprasath</w:t>
+            </w:r>
+          </w:p>
+        </w:tc>
+        <w:tc>
+          <w:tcPr/>
+          <w:p>
+            <w:pPr>
+              <w:pStyle w:val="Compact"/>
+              <w:jc w:val="right"/>
+            </w:pPr>
+            <w:r>
+              <w:t xml:space="preserve">3</w:t>
+            </w:r>
+          </w:p>
+        </w:tc>
+      </w:tr>
+      <w:tr>
+        <w:tc>
+          <w:tcPr/>
+          <w:p>
+            <w:pPr>
+              <w:pStyle w:val="Compact"/>
+            </w:pPr>
+            <w:r>
+              <w:t xml:space="preserve">6</w:t>
+            </w:r>
+          </w:p>
+        </w:tc>
+        <w:tc>
+          <w:tcPr/>
+          <w:p>
+            <w:pPr>
+              <w:pStyle w:val="Compact"/>
+            </w:pPr>
+            <w:r>
+              <w:t xml:space="preserve">Publisher CLI and contract tests</w:t>
+            </w:r>
+          </w:p>
+        </w:tc>
+        <w:tc>
+          <w:tcPr/>
+          <w:p>
+            <w:pPr>
+              <w:pStyle w:val="Compact"/>
+            </w:pPr>
+            <w:r>
+              <w:t xml:space="preserve">Long</w:t>
+            </w:r>
+          </w:p>
+        </w:tc>
+        <w:tc>
+          <w:tcPr/>
+          <w:p>
+            <w:pPr>
+              <w:pStyle w:val="Compact"/>
+              <w:jc w:val="right"/>
             </w:pPr>
             <w:r>
               <w:t xml:space="preserve">2</w:t>
             </w:r>
           </w:p>
         </w:tc>
-        <w:tc>
-          <w:tcPr/>
-          <w:p>
-            <w:pPr>
-              <w:pStyle w:val="Compact"/>
-            </w:pPr>
-            <w:r>
-              <w:t xml:space="preserve">Domain analysis, service contracts and OpenAPI documents</w:t>
-            </w:r>
-          </w:p>
-        </w:tc>
-        <w:tc>
-          <w:tcPr/>
-          <w:p>
-            <w:pPr>
-              <w:pStyle w:val="Compact"/>
-            </w:pPr>
-            <w:r>
-              <w:t xml:space="preserve">Long (team review)</w:t>
+      </w:tr>
+      <w:tr>
+        <w:tc>
+          <w:tcPr/>
+          <w:p>
+            <w:pPr>
+              <w:pStyle w:val="Compact"/>
+            </w:pPr>
+            <w:r>
+              <w:t xml:space="preserve">7</w:t>
+            </w:r>
+          </w:p>
+        </w:tc>
+        <w:tc>
+          <w:tcPr/>
+          <w:p>
+            <w:pPr>
+              <w:pStyle w:val="Compact"/>
+            </w:pPr>
+            <w:r>
+              <w:t xml:space="preserve">AWS environment in Terraform (VPC, EC2, RDS, S3, ECR, IAM), OIDC deploy role, per-service deployment, pipeline adaptation, smoke test</w:t>
+            </w:r>
+          </w:p>
+        </w:tc>
+        <w:tc>
+          <w:tcPr/>
+          <w:p>
+            <w:pPr>
+              <w:pStyle w:val="Compact"/>
+            </w:pPr>
+            <w:r>
+              <w:t xml:space="preserve">Guruprasath</w:t>
             </w:r>
           </w:p>
         </w:tc>
@@ -4492,242 +5230,7 @@
               <w:jc w:val="right"/>
             </w:pPr>
             <w:r>
-              <w:t xml:space="preserve">3</w:t>
-            </w:r>
-          </w:p>
-        </w:tc>
-      </w:tr>
-      <w:tr>
-        <w:tc>
-          <w:tcPr/>
-          <w:p>
-            <w:pPr>
-              <w:pStyle w:val="Compact"/>
-            </w:pPr>
-            <w:r>
-              <w:t xml:space="preserve">3</w:t>
-            </w:r>
-          </w:p>
-        </w:tc>
-        <w:tc>
-          <w:tcPr/>
-          <w:p>
-            <w:pPr>
-              <w:pStyle w:val="Compact"/>
-            </w:pPr>
-            <w:r>
-              <w:t xml:space="preserve">Extract Processing: service, own database and migrations, workers and recovery task</w:t>
-            </w:r>
-          </w:p>
-        </w:tc>
-        <w:tc>
-          <w:tcPr/>
-          <w:p>
-            <w:pPr>
-              <w:pStyle w:val="Compact"/>
-            </w:pPr>
-            <w:r>
-              <w:t xml:space="preserve">Ibrahim</w:t>
-            </w:r>
-          </w:p>
-        </w:tc>
-        <w:tc>
-          <w:tcPr/>
-          <w:p>
-            <w:pPr>
-              <w:pStyle w:val="Compact"/>
-              <w:jc w:val="right"/>
-            </w:pPr>
-            <w:r>
-              <w:t xml:space="preserve">6</w:t>
-            </w:r>
-          </w:p>
-        </w:tc>
-      </w:tr>
-      <w:tr>
-        <w:tc>
-          <w:tcPr/>
-          <w:p>
-            <w:pPr>
-              <w:pStyle w:val="Compact"/>
-            </w:pPr>
-            <w:r>
-              <w:t xml:space="preserve">4</w:t>
-            </w:r>
-          </w:p>
-        </w:tc>
-        <w:tc>
-          <w:tcPr/>
-          <w:p>
-            <w:pPr>
-              <w:pStyle w:val="Compact"/>
-            </w:pPr>
-            <w:r>
-              <w:t xml:space="preserve">Adapt Media Management: asset records, Processing client, web app routes and retry</w:t>
-            </w:r>
-          </w:p>
-        </w:tc>
-        <w:tc>
-          <w:tcPr/>
-          <w:p>
-            <w:pPr>
-              <w:pStyle w:val="Compact"/>
-            </w:pPr>
-            <w:r>
-              <w:t xml:space="preserve">Ibrahim</w:t>
-            </w:r>
-          </w:p>
-        </w:tc>
-        <w:tc>
-          <w:tcPr/>
-          <w:p>
-            <w:pPr>
-              <w:pStyle w:val="Compact"/>
-              <w:jc w:val="right"/>
-            </w:pPr>
-            <w:r>
-              <w:t xml:space="preserve">3</w:t>
-            </w:r>
-          </w:p>
-        </w:tc>
-      </w:tr>
-      <w:tr>
-        <w:tc>
-          <w:tcPr/>
-          <w:p>
-            <w:pPr>
-              <w:pStyle w:val="Compact"/>
-            </w:pPr>
-            <w:r>
               <w:t xml:space="preserve">5</w:t>
-            </w:r>
-          </w:p>
-        </w:tc>
-        <w:tc>
-          <w:tcPr/>
-          <w:p>
-            <w:pPr>
-              <w:pStyle w:val="Compact"/>
-            </w:pPr>
-            <w:r>
-              <w:t xml:space="preserve">Boundary security: service token, owner checks, database roles, presigned URLs, negative tests</w:t>
-            </w:r>
-          </w:p>
-        </w:tc>
-        <w:tc>
-          <w:tcPr/>
-          <w:p>
-            <w:pPr>
-              <w:pStyle w:val="Compact"/>
-            </w:pPr>
-            <w:r>
-              <w:t xml:space="preserve">Guruprasath</w:t>
-            </w:r>
-          </w:p>
-        </w:tc>
-        <w:tc>
-          <w:tcPr/>
-          <w:p>
-            <w:pPr>
-              <w:pStyle w:val="Compact"/>
-              <w:jc w:val="right"/>
-            </w:pPr>
-            <w:r>
-              <w:t xml:space="preserve">3</w:t>
-            </w:r>
-          </w:p>
-        </w:tc>
-      </w:tr>
-      <w:tr>
-        <w:tc>
-          <w:tcPr/>
-          <w:p>
-            <w:pPr>
-              <w:pStyle w:val="Compact"/>
-            </w:pPr>
-            <w:r>
-              <w:t xml:space="preserve">6</w:t>
-            </w:r>
-          </w:p>
-        </w:tc>
-        <w:tc>
-          <w:tcPr/>
-          <w:p>
-            <w:pPr>
-              <w:pStyle w:val="Compact"/>
-            </w:pPr>
-            <w:r>
-              <w:t xml:space="preserve">Publisher CLI and contract tests</w:t>
-            </w:r>
-          </w:p>
-        </w:tc>
-        <w:tc>
-          <w:tcPr/>
-          <w:p>
-            <w:pPr>
-              <w:pStyle w:val="Compact"/>
-            </w:pPr>
-            <w:r>
-              <w:t xml:space="preserve">Long</w:t>
-            </w:r>
-          </w:p>
-        </w:tc>
-        <w:tc>
-          <w:tcPr/>
-          <w:p>
-            <w:pPr>
-              <w:pStyle w:val="Compact"/>
-              <w:jc w:val="right"/>
-            </w:pPr>
-            <w:r>
-              <w:t xml:space="preserve">2</w:t>
-            </w:r>
-          </w:p>
-        </w:tc>
-      </w:tr>
-      <w:tr>
-        <w:tc>
-          <w:tcPr/>
-          <w:p>
-            <w:pPr>
-              <w:pStyle w:val="Compact"/>
-            </w:pPr>
-            <w:r>
-              <w:t xml:space="preserve">7</w:t>
-            </w:r>
-          </w:p>
-        </w:tc>
-        <w:tc>
-          <w:tcPr/>
-          <w:p>
-            <w:pPr>
-              <w:pStyle w:val="Compact"/>
-            </w:pPr>
-            <w:r>
-              <w:t xml:space="preserve">Cloud environment, per-service deploy scripts, pipeline adaptation, smoke test</w:t>
-            </w:r>
-          </w:p>
-        </w:tc>
-        <w:tc>
-          <w:tcPr/>
-          <w:p>
-            <w:pPr>
-              <w:pStyle w:val="Compact"/>
-            </w:pPr>
-            <w:r>
-              <w:t xml:space="preserve">Guruprasath</w:t>
-            </w:r>
-          </w:p>
-        </w:tc>
-        <w:tc>
-          <w:tcPr/>
-          <w:p>
-            <w:pPr>
-              <w:pStyle w:val="Compact"/>
-              <w:jc w:val="right"/>
-            </w:pPr>
-            <w:r>
-              <w:t xml:space="preserve">4</w:t>
             </w:r>
           </w:p>
         </w:tc>
@@ -5070,7 +5573,7 @@
               <w:pStyle w:val="Compact"/>
             </w:pPr>
             <w:r>
-              <w:t xml:space="preserve">Security controls and tests; cloud deployment and pipeline; baseline run, then final experiments</w:t>
+              <w:t xml:space="preserve">Security controls and tests; AWS deployment and pipeline; baseline run, then final experiments</w:t>
             </w:r>
           </w:p>
         </w:tc>
@@ -5251,29 +5754,29 @@
               <w:pStyle w:val="Compact"/>
             </w:pPr>
             <w:r>
-              <w:t xml:space="preserve">Cloud account or resize delays</w:t>
-            </w:r>
-          </w:p>
-        </w:tc>
-        <w:tc>
-          <w:tcPr/>
-          <w:p>
-            <w:pPr>
-              <w:pStyle w:val="Compact"/>
-            </w:pPr>
-            <w:r>
-              <w:t xml:space="preserve">Late experiments</w:t>
-            </w:r>
-          </w:p>
-        </w:tc>
-        <w:tc>
-          <w:tcPr/>
-          <w:p>
-            <w:pPr>
-              <w:pStyle w:val="Compact"/>
-            </w:pPr>
-            <w:r>
-              <w:t xml:space="preserve">Identical Compose stack runs locally; provision the ECS instance in week 1</w:t>
+              <w:t xml:space="preserve">AWS account limits or cost overrun</w:t>
+            </w:r>
+          </w:p>
+        </w:tc>
+        <w:tc>
+          <w:tcPr/>
+          <w:p>
+            <w:pPr>
+              <w:pStyle w:val="Compact"/>
+            </w:pPr>
+            <w:r>
+              <w:t xml:space="preserve">Late experiments or blocked environment</w:t>
+            </w:r>
+          </w:p>
+        </w:tc>
+        <w:tc>
+          <w:tcPr/>
+          <w:p>
+            <w:pPr>
+              <w:pStyle w:val="Compact"/>
+            </w:pPr>
+            <w:r>
+              <w:t xml:space="preserve">Provision with Terraform in week 1 and check the vCPU quota early; budget alerts; stop instances when idle; identical Compose stack runs locally</w:t>
             </w:r>
           </w:p>
         </w:tc>
@@ -5368,7 +5871,7 @@
         </w:numPr>
       </w:pPr>
       <w:r>
-        <w:t xml:space="preserve">The team has access to an Alibaba Cloud account and test credentials in week 1.</w:t>
+        <w:t xml:space="preserve">The team has an AWS account with enough EC2 vCPU quota in ap-southeast-1 by week 1.</w:t>
       </w:r>
     </w:p>
     <w:p>

</xml_diff>

<commit_message>
docs(project-2): simplify proposal deployment section
Cut the AWS service list, Terraform, OIDC and sizing details from the
proposal so it commits only to AWS, containers, per-service databases,
private storage and an automated test-scan-deploy-smoke pipeline. The
briefing accepts a logical view before deployment details are settled,
and specific AWS services will be chosen in week 1.

Replace Figure 4 with a simpler pipeline and deployment diagram.
</commit_message>
<xml_diff>
--- a/docs/project-2-proposal.docx
+++ b/docs/project-2-proposal.docx
@@ -1885,7 +1885,7 @@
               <w:t xml:space="preserve"> </w:t>
             </w:r>
             <w:r>
-              <w:t xml:space="preserve">on one Amazon RDS for PostgreSQL instance: separate databases, roles and migration histories</w:t>
+              <w:t xml:space="preserve">on one PostgreSQL server: separate databases, roles and migration histories</w:t>
             </w:r>
           </w:p>
         </w:tc>
@@ -2200,32 +2200,29 @@
                 <w:b/>
                 <w:bCs/>
               </w:rPr>
-              <w:t xml:space="preserve">Run the services on one Amazon EC2 instance with Docker Compose</w:t>
-            </w:r>
-            <w:r>
-              <w:t xml:space="preserve">, worker replicas capped at 2 vCPU each</w:t>
-            </w:r>
-          </w:p>
-        </w:tc>
-        <w:tc>
-          <w:tcPr/>
-          <w:p>
-            <w:pPr>
-              <w:pStyle w:val="Compact"/>
-            </w:pPr>
-            <w:r>
-              <w:t xml:space="preserve">Low cost, reuses the team’s existing Compose tooling, and gives a fair and repeatable scaling experiment</w:t>
-            </w:r>
-          </w:p>
-        </w:tc>
-        <w:tc>
-          <w:tcPr/>
-          <w:p>
-            <w:pPr>
-              <w:pStyle w:val="Compact"/>
-            </w:pPr>
-            <w:r>
-              <w:t xml:space="preserve">Amazon ECS on Fargate or EKS: better for production scaling, but adds operational work outside the project’s focus</w:t>
+              <w:t xml:space="preserve">Host on AWS using containers, in one small environment</w:t>
+            </w:r>
+          </w:p>
+        </w:tc>
+        <w:tc>
+          <w:tcPr/>
+          <w:p>
+            <w:pPr>
+              <w:pStyle w:val="Compact"/>
+            </w:pPr>
+            <w:r>
+              <w:t xml:space="preserve">Containers already exist from Project 1; one environment keeps cost and operations low. Exact AWS services are confirmed in week 1</w:t>
+            </w:r>
+          </w:p>
+        </w:tc>
+        <w:tc>
+          <w:tcPr/>
+          <w:p>
+            <w:pPr>
+              <w:pStyle w:val="Compact"/>
+            </w:pPr>
+            <w:r>
+              <w:t xml:space="preserve">Kubernetes or a multi-environment setup: more operational work than the project needs</w:t>
             </w:r>
           </w:p>
         </w:tc>
@@ -2239,115 +2236,6 @@
             </w:pPr>
             <w:r>
               <w:t xml:space="preserve">AD-08</w:t>
-            </w:r>
-          </w:p>
-        </w:tc>
-        <w:tc>
-          <w:tcPr/>
-          <w:p>
-            <w:pPr>
-              <w:pStyle w:val="Compact"/>
-            </w:pPr>
-            <w:r>
-              <w:rPr>
-                <w:b/>
-                <w:bCs/>
-              </w:rPr>
-              <w:t xml:space="preserve">Use AWS managed services for state and operations</w:t>
-            </w:r>
-            <w:r>
-              <w:t xml:space="preserve">: RDS for PostgreSQL, S3, ECR, SSM Parameter Store and CloudWatch</w:t>
-            </w:r>
-          </w:p>
-        </w:tc>
-        <w:tc>
-          <w:tcPr/>
-          <w:p>
-            <w:pPr>
-              <w:pStyle w:val="Compact"/>
-            </w:pPr>
-            <w:r>
-              <w:t xml:space="preserve">No database or storage server to run; S3 presigned URLs and bucket policies give least-privilege media access natively; managed backups and metrics</w:t>
-            </w:r>
-          </w:p>
-        </w:tc>
-        <w:tc>
-          <w:tcPr/>
-          <w:p>
-            <w:pPr>
-              <w:pStyle w:val="Compact"/>
-            </w:pPr>
-            <w:r>
-              <w:t xml:space="preserve">Self-hosting PostgreSQL and MinIO on the instance: cheaper, but more operational work and weaker isolation</w:t>
-            </w:r>
-          </w:p>
-        </w:tc>
-      </w:tr>
-      <w:tr>
-        <w:tc>
-          <w:tcPr/>
-          <w:p>
-            <w:pPr>
-              <w:pStyle w:val="Compact"/>
-            </w:pPr>
-            <w:r>
-              <w:t xml:space="preserve">AD-09</w:t>
-            </w:r>
-          </w:p>
-        </w:tc>
-        <w:tc>
-          <w:tcPr/>
-          <w:p>
-            <w:pPr>
-              <w:pStyle w:val="Compact"/>
-            </w:pPr>
-            <w:r>
-              <w:rPr>
-                <w:b/>
-                <w:bCs/>
-              </w:rPr>
-              <w:t xml:space="preserve">Define the AWS resources in Terraform</w:t>
-            </w:r>
-            <w:r>
-              <w:t xml:space="preserve"> </w:t>
-            </w:r>
-            <w:r>
-              <w:t xml:space="preserve">(VPC, security groups, EC2, RDS, S3, ECR, IAM)</w:t>
-            </w:r>
-          </w:p>
-        </w:tc>
-        <w:tc>
-          <w:tcPr/>
-          <w:p>
-            <w:pPr>
-              <w:pStyle w:val="Compact"/>
-            </w:pPr>
-            <w:r>
-              <w:t xml:space="preserve">The environment can be recreated and reviewed like code; changes go through pull requests</w:t>
-            </w:r>
-          </w:p>
-        </w:tc>
-        <w:tc>
-          <w:tcPr/>
-          <w:p>
-            <w:pPr>
-              <w:pStyle w:val="Compact"/>
-            </w:pPr>
-            <w:r>
-              <w:t xml:space="preserve">Console set-up: faster at first, but not repeatable or reviewable</w:t>
-            </w:r>
-          </w:p>
-        </w:tc>
-      </w:tr>
-      <w:tr>
-        <w:tc>
-          <w:tcPr/>
-          <w:p>
-            <w:pPr>
-              <w:pStyle w:val="Compact"/>
-            </w:pPr>
-            <w:r>
-              <w:t xml:space="preserve">AD-10</w:t>
             </w:r>
           </w:p>
         </w:tc>
@@ -2391,13 +2279,13 @@
       </w:tr>
     </w:tbl>
     <w:bookmarkEnd w:id="26"/>
-    <w:bookmarkStart w:id="30" w:name="X2428de7bb8fcfaaffaca748f86115a5a0e4b5d5"/>
+    <w:bookmarkStart w:id="30" w:name="deployment-and-delivery"/>
     <w:p>
       <w:pPr>
         <w:pStyle w:val="Heading3"/>
       </w:pPr>
       <w:r>
-        <w:t xml:space="preserve">2.5 Physical architecture and delivery pipeline</w:t>
+        <w:t xml:space="preserve">2.5 Deployment and delivery</w:t>
       </w:r>
     </w:p>
     <w:p>
@@ -2407,9 +2295,9 @@
       <w:r>
         <w:drawing>
           <wp:inline>
-            <wp:extent cx="5334000" cy="3200400"/>
+            <wp:extent cx="5334000" cy="1813560"/>
             <wp:effectExtent b="0" l="0" r="0" t="0"/>
-            <wp:docPr descr="Figure 4. Delivery pipeline and cloud deployment" title="" id="28" name="Picture"/>
+            <wp:docPr descr="Figure 4. Delivery pipeline and AWS deployment" title="" id="28" name="Picture"/>
             <a:graphic>
               <a:graphicData uri="http://schemas.openxmlformats.org/drawingml/2006/picture">
                 <pic:pic>
@@ -2428,7 +2316,7 @@
                   <pic:spPr bwMode="auto">
                     <a:xfrm>
                       <a:off x="0" y="0"/>
-                      <a:ext cx="5334000" cy="3200400"/>
+                      <a:ext cx="5334000" cy="1813560"/>
                     </a:xfrm>
                     <a:prstGeom prst="rect">
                       <a:avLst/>
@@ -2456,7 +2344,7 @@
           <w:i/>
           <w:iCs/>
         </w:rPr>
-        <w:t xml:space="preserve">Figure 4. Every change passes the GitHub Actions pipeline. Images are pushed to Amazon ECR and deployed per service to an EC2 instance through AWS Systems Manager. Only HTTPS is exposed; RDS sits in a private subnet and S3 buckets are private.</w:t>
+        <w:t xml:space="preserve">Figure 4. Every change goes through an automated pipeline before it is deployed to AWS. Only HTTPS is public; the databases and storage are private.</w:t>
       </w:r>
     </w:p>
     <w:p>
@@ -2464,7 +2352,7 @@
         <w:pStyle w:val="BodyText"/>
       </w:pPr>
       <w:r>
-        <w:t xml:space="preserve">The whole platform runs on</w:t>
+        <w:t xml:space="preserve">The platform will run on</w:t>
       </w:r>
       <w:r>
         <w:t xml:space="preserve"> </w:t>
@@ -2474,379 +2362,66 @@
           <w:b/>
           <w:bCs/>
         </w:rPr>
-        <w:t xml:space="preserve">AWS in the Singapore region (ap-southeast-1)</w:t>
-      </w:r>
-      <w:r>
-        <w:t xml:space="preserve">:</w:t>
-      </w:r>
-    </w:p>
-    <w:tbl>
-      <w:tblPr>
-        <w:tblStyle w:val="Table"/>
-        <w:tblW w:type="pct" w:w="5000"/>
-        <w:tblLayout w:type="fixed"/>
-        <w:tblLook w:firstRow="1" w:lastRow="0" w:firstColumn="0" w:lastColumn="0" w:noHBand="0" w:noVBand="0" w:val="0020"/>
-      </w:tblPr>
-      <w:tblGrid>
-        <w:gridCol w:w="1277"/>
-        <w:gridCol w:w="1532"/>
-        <w:gridCol w:w="5109"/>
-      </w:tblGrid>
-      <w:tr>
-        <w:trPr>
-          <w:tblHeader w:val="on"/>
-        </w:trPr>
-        <w:tc>
-          <w:tcPr/>
-          <w:p>
-            <w:pPr>
-              <w:pStyle w:val="Compact"/>
-            </w:pPr>
-            <w:r>
-              <w:t xml:space="preserve">Need</w:t>
-            </w:r>
-          </w:p>
-        </w:tc>
-        <w:tc>
-          <w:tcPr/>
-          <w:p>
-            <w:pPr>
-              <w:pStyle w:val="Compact"/>
-            </w:pPr>
-            <w:r>
-              <w:t xml:space="preserve">AWS service</w:t>
-            </w:r>
-          </w:p>
-        </w:tc>
-        <w:tc>
-          <w:tcPr/>
-          <w:p>
-            <w:pPr>
-              <w:pStyle w:val="Compact"/>
-            </w:pPr>
-            <w:r>
-              <w:t xml:space="preserve">How we use it</w:t>
-            </w:r>
-          </w:p>
-        </w:tc>
-      </w:tr>
-      <w:tr>
-        <w:tc>
-          <w:tcPr/>
-          <w:p>
-            <w:pPr>
-              <w:pStyle w:val="Compact"/>
-            </w:pPr>
-            <w:r>
-              <w:t xml:space="preserve">Compute</w:t>
-            </w:r>
-          </w:p>
-        </w:tc>
-        <w:tc>
-          <w:tcPr/>
-          <w:p>
-            <w:pPr>
-              <w:pStyle w:val="Compact"/>
-            </w:pPr>
-            <w:r>
-              <w:t xml:space="preserve">Amazon EC2</w:t>
-            </w:r>
-          </w:p>
-        </w:tc>
-        <w:tc>
-          <w:tcPr/>
-          <w:p>
-            <w:pPr>
-              <w:pStyle w:val="Compact"/>
-            </w:pPr>
-            <w:r>
-              <w:t xml:space="preserve">One instance runs ingress, both service APIs, Redis, the workers and the recovery task with Docker Compose. 4 vCPU / 8 GiB for development; resized to 8 vCPU / 16 GiB for the scaling experiment so three 2-vCPU workers have room</w:t>
-            </w:r>
-          </w:p>
-        </w:tc>
-      </w:tr>
-      <w:tr>
-        <w:tc>
-          <w:tcPr/>
-          <w:p>
-            <w:pPr>
-              <w:pStyle w:val="Compact"/>
-            </w:pPr>
-            <w:r>
-              <w:t xml:space="preserve">Relational data</w:t>
-            </w:r>
-          </w:p>
-        </w:tc>
-        <w:tc>
-          <w:tcPr/>
-          <w:p>
-            <w:pPr>
-              <w:pStyle w:val="Compact"/>
-            </w:pPr>
-            <w:r>
-              <w:t xml:space="preserve">Amazon RDS for PostgreSQL</w:t>
-            </w:r>
-          </w:p>
-        </w:tc>
-        <w:tc>
-          <w:tcPr/>
-          <w:p>
-            <w:pPr>
-              <w:pStyle w:val="Compact"/>
-            </w:pPr>
-            <w:r>
-              <w:t xml:space="preserve">Single-AZ instance in a private subnet holding</w:t>
-            </w:r>
-            <w:r>
-              <w:t xml:space="preserve"> </w:t>
-            </w:r>
-            <w:r>
-              <w:rPr>
-                <w:rStyle w:val="VerbatimChar"/>
-              </w:rPr>
-              <w:t xml:space="preserve">media_db</w:t>
-            </w:r>
-            <w:r>
-              <w:t xml:space="preserve"> </w:t>
-            </w:r>
-            <w:r>
-              <w:t xml:space="preserve">and</w:t>
-            </w:r>
-            <w:r>
-              <w:t xml:space="preserve"> </w:t>
-            </w:r>
-            <w:r>
-              <w:rPr>
-                <w:rStyle w:val="VerbatimChar"/>
-              </w:rPr>
-              <w:t xml:space="preserve">processing_db</w:t>
-            </w:r>
-            <w:r>
-              <w:t xml:space="preserve">, each with its own role</w:t>
-            </w:r>
-          </w:p>
-        </w:tc>
-      </w:tr>
-      <w:tr>
-        <w:tc>
-          <w:tcPr/>
-          <w:p>
-            <w:pPr>
-              <w:pStyle w:val="Compact"/>
-            </w:pPr>
-            <w:r>
-              <w:t xml:space="preserve">Media files</w:t>
-            </w:r>
-          </w:p>
-        </w:tc>
-        <w:tc>
-          <w:tcPr/>
-          <w:p>
-            <w:pPr>
-              <w:pStyle w:val="Compact"/>
-            </w:pPr>
-            <w:r>
-              <w:t xml:space="preserve">Amazon S3</w:t>
-            </w:r>
-          </w:p>
-        </w:tc>
-        <w:tc>
-          <w:tcPr/>
-          <w:p>
-            <w:pPr>
-              <w:pStyle w:val="Compact"/>
-            </w:pPr>
-            <w:r>
-              <w:t xml:space="preserve">Private, encrypted</w:t>
-            </w:r>
-            <w:r>
-              <w:t xml:space="preserve"> </w:t>
-            </w:r>
-            <w:r>
-              <w:rPr>
-                <w:rStyle w:val="VerbatimChar"/>
-              </w:rPr>
-              <w:t xml:space="preserve">sources</w:t>
-            </w:r>
-            <w:r>
-              <w:t xml:space="preserve"> </w:t>
-            </w:r>
-            <w:r>
-              <w:t xml:space="preserve">and</w:t>
-            </w:r>
-            <w:r>
-              <w:t xml:space="preserve"> </w:t>
-            </w:r>
-            <w:r>
-              <w:rPr>
-                <w:rStyle w:val="VerbatimChar"/>
-              </w:rPr>
-              <w:t xml:space="preserve">outputs</w:t>
-            </w:r>
-            <w:r>
-              <w:t xml:space="preserve"> </w:t>
-            </w:r>
-            <w:r>
-              <w:t xml:space="preserve">buckets with Block Public Access; access only through presigned URLs</w:t>
-            </w:r>
-          </w:p>
-        </w:tc>
-      </w:tr>
-      <w:tr>
-        <w:tc>
-          <w:tcPr/>
-          <w:p>
-            <w:pPr>
-              <w:pStyle w:val="Compact"/>
-            </w:pPr>
-            <w:r>
-              <w:t xml:space="preserve">Images</w:t>
-            </w:r>
-          </w:p>
-        </w:tc>
-        <w:tc>
-          <w:tcPr/>
-          <w:p>
-            <w:pPr>
-              <w:pStyle w:val="Compact"/>
-            </w:pPr>
-            <w:r>
-              <w:t xml:space="preserve">Amazon ECR</w:t>
-            </w:r>
-          </w:p>
-        </w:tc>
-        <w:tc>
-          <w:tcPr/>
-          <w:p>
-            <w:pPr>
-              <w:pStyle w:val="Compact"/>
-            </w:pPr>
-            <w:r>
-              <w:t xml:space="preserve">One repository per service; images tagged with the commit SHA</w:t>
-            </w:r>
-          </w:p>
-        </w:tc>
-      </w:tr>
-      <w:tr>
-        <w:tc>
-          <w:tcPr/>
-          <w:p>
-            <w:pPr>
-              <w:pStyle w:val="Compact"/>
-            </w:pPr>
-            <w:r>
-              <w:t xml:space="preserve">Secrets</w:t>
-            </w:r>
-          </w:p>
-        </w:tc>
-        <w:tc>
-          <w:tcPr/>
-          <w:p>
-            <w:pPr>
-              <w:pStyle w:val="Compact"/>
-            </w:pPr>
-            <w:r>
-              <w:t xml:space="preserve">SSM Parameter Store</w:t>
-            </w:r>
-          </w:p>
-        </w:tc>
-        <w:tc>
-          <w:tcPr/>
-          <w:p>
-            <w:pPr>
-              <w:pStyle w:val="Compact"/>
-            </w:pPr>
-            <w:r>
-              <w:t xml:space="preserve">Service token, database passwords and JWT signing key as SecureString parameters</w:t>
-            </w:r>
-          </w:p>
-        </w:tc>
-      </w:tr>
-      <w:tr>
-        <w:tc>
-          <w:tcPr/>
-          <w:p>
-            <w:pPr>
-              <w:pStyle w:val="Compact"/>
-            </w:pPr>
-            <w:r>
-              <w:t xml:space="preserve">Deployment access</w:t>
-            </w:r>
-          </w:p>
-        </w:tc>
-        <w:tc>
-          <w:tcPr/>
-          <w:p>
-            <w:pPr>
-              <w:pStyle w:val="Compact"/>
-            </w:pPr>
-            <w:r>
-              <w:t xml:space="preserve">IAM + SSM</w:t>
-            </w:r>
-          </w:p>
-        </w:tc>
-        <w:tc>
-          <w:tcPr/>
-          <w:p>
-            <w:pPr>
-              <w:pStyle w:val="Compact"/>
-            </w:pPr>
-            <w:r>
-              <w:t xml:space="preserve">GitHub Actions assumes a deploy role through OIDC (no stored access keys) and deploys with SSM Run Command; no SSH port is open</w:t>
-            </w:r>
-          </w:p>
-        </w:tc>
-      </w:tr>
-      <w:tr>
-        <w:tc>
-          <w:tcPr/>
-          <w:p>
-            <w:pPr>
-              <w:pStyle w:val="Compact"/>
-            </w:pPr>
-            <w:r>
-              <w:t xml:space="preserve">Observability and cost</w:t>
-            </w:r>
-          </w:p>
-        </w:tc>
-        <w:tc>
-          <w:tcPr/>
-          <w:p>
-            <w:pPr>
-              <w:pStyle w:val="Compact"/>
-            </w:pPr>
-            <w:r>
-              <w:t xml:space="preserve">CloudWatch, AWS Budgets</w:t>
-            </w:r>
-          </w:p>
-        </w:tc>
-        <w:tc>
-          <w:tcPr/>
-          <w:p>
-            <w:pPr>
-              <w:pStyle w:val="Compact"/>
-            </w:pPr>
-            <w:r>
-              <w:t xml:space="preserve">Container logs and CPU/memory metrics for the experiments; budget alerts at 50% and 80%</w:t>
-            </w:r>
-          </w:p>
-        </w:tc>
-      </w:tr>
-    </w:tbl>
-    <w:p>
-      <w:pPr>
-        <w:pStyle w:val="BodyText"/>
-      </w:pPr>
-      <w:r>
-        <w:t xml:space="preserve">All resources are defined in Terraform. The EC2 and RDS instances are stopped outside work and test sessions, and the target AWS spend is under US$100 for the project.</w:t>
-      </w:r>
-    </w:p>
-    <w:p>
-      <w:pPr>
-        <w:pStyle w:val="BodyText"/>
-      </w:pPr>
-      <w:r>
-        <w:t xml:space="preserve">The same images also run locally with Docker Compose, using PostgreSQL and MinIO containers (MinIO speaks the S3 API) in place of RDS and S3, so every scenario can be reproduced on a developer machine before it runs on AWS.</w:t>
+        <w:t xml:space="preserve">AWS</w:t>
+      </w:r>
+      <w:r>
+        <w:t xml:space="preserve">. We commit to the following, and will choose the specific AWS services during week 1:</w:t>
+      </w:r>
+    </w:p>
+    <w:p>
+      <w:pPr>
+        <w:pStyle w:val="Compact"/>
+        <w:numPr>
+          <w:ilvl w:val="0"/>
+          <w:numId w:val="1004"/>
+        </w:numPr>
+      </w:pPr>
+      <w:r>
+        <w:t xml:space="preserve">Both services and the workers run as containers, and each service can be deployed on its own.</w:t>
+      </w:r>
+    </w:p>
+    <w:p>
+      <w:pPr>
+        <w:pStyle w:val="Compact"/>
+        <w:numPr>
+          <w:ilvl w:val="0"/>
+          <w:numId w:val="1004"/>
+        </w:numPr>
+      </w:pPr>
+      <w:r>
+        <w:t xml:space="preserve">Each service has its own database; media files are kept in private object storage.</w:t>
+      </w:r>
+    </w:p>
+    <w:p>
+      <w:pPr>
+        <w:pStyle w:val="Compact"/>
+        <w:numPr>
+          <w:ilvl w:val="0"/>
+          <w:numId w:val="1004"/>
+        </w:numPr>
+      </w:pPr>
+      <w:r>
+        <w:t xml:space="preserve">Only HTTPS is exposed to the internet, and secrets are kept out of the code.</w:t>
+      </w:r>
+    </w:p>
+    <w:p>
+      <w:pPr>
+        <w:pStyle w:val="Compact"/>
+        <w:numPr>
+          <w:ilvl w:val="0"/>
+          <w:numId w:val="1004"/>
+        </w:numPr>
+      </w:pPr>
+      <w:r>
+        <w:t xml:space="preserve">An automated pipeline builds, tests and scans every change, deploys it, and runs an upload-to-playback smoke test.</w:t>
+      </w:r>
+    </w:p>
+    <w:p>
+      <w:pPr>
+        <w:pStyle w:val="FirstParagraph"/>
+      </w:pPr>
+      <w:r>
+        <w:t xml:space="preserve">The same containers also run on a developer machine, so every scenario can be tried locally before it runs on AWS.</w:t>
       </w:r>
     </w:p>
     <w:p>
@@ -3521,7 +3096,7 @@
         <w:pStyle w:val="Compact"/>
         <w:numPr>
           <w:ilvl w:val="0"/>
-          <w:numId w:val="1004"/>
+          <w:numId w:val="1005"/>
         </w:numPr>
       </w:pPr>
       <w:r>
@@ -3533,7 +3108,7 @@
         <w:pStyle w:val="Compact"/>
         <w:numPr>
           <w:ilvl w:val="0"/>
-          <w:numId w:val="1004"/>
+          <w:numId w:val="1005"/>
         </w:numPr>
       </w:pPr>
       <w:r>
@@ -3545,7 +3120,7 @@
         <w:pStyle w:val="Compact"/>
         <w:numPr>
           <w:ilvl w:val="0"/>
-          <w:numId w:val="1004"/>
+          <w:numId w:val="1005"/>
         </w:numPr>
       </w:pPr>
       <w:r>
@@ -3557,7 +3132,7 @@
         <w:pStyle w:val="Compact"/>
         <w:numPr>
           <w:ilvl w:val="0"/>
-          <w:numId w:val="1004"/>
+          <w:numId w:val="1005"/>
         </w:numPr>
       </w:pPr>
       <w:r>
@@ -3569,7 +3144,7 @@
         <w:pStyle w:val="Compact"/>
         <w:numPr>
           <w:ilvl w:val="0"/>
-          <w:numId w:val="1004"/>
+          <w:numId w:val="1005"/>
         </w:numPr>
       </w:pPr>
       <w:r>
@@ -3601,11 +3176,11 @@
         <w:pStyle w:val="Compact"/>
         <w:numPr>
           <w:ilvl w:val="0"/>
-          <w:numId w:val="1005"/>
+          <w:numId w:val="1006"/>
         </w:numPr>
       </w:pPr>
       <w:r>
-        <w:t xml:space="preserve">Services are packaged as immutable, versioned containers stored in Amazon ECR.</w:t>
+        <w:t xml:space="preserve">Services are packaged as versioned containers.</w:t>
       </w:r>
     </w:p>
     <w:p>
@@ -3613,11 +3188,11 @@
         <w:pStyle w:val="Compact"/>
         <w:numPr>
           <w:ilvl w:val="0"/>
-          <w:numId w:val="1005"/>
+          <w:numId w:val="1006"/>
         </w:numPr>
       </w:pPr>
       <w:r>
-        <w:t xml:space="preserve">APIs and workers are stateless; durable state lives in managed services (RDS and S3).</w:t>
+        <w:t xml:space="preserve">APIs and workers are stateless; durable state lives in the databases and object storage.</w:t>
       </w:r>
     </w:p>
     <w:p>
@@ -3625,11 +3200,11 @@
         <w:pStyle w:val="Compact"/>
         <w:numPr>
           <w:ilvl w:val="0"/>
-          <w:numId w:val="1005"/>
+          <w:numId w:val="1006"/>
         </w:numPr>
       </w:pPr>
       <w:r>
-        <w:t xml:space="preserve">Configuration and secrets are kept outside the images, in SSM Parameter Store.</w:t>
+        <w:t xml:space="preserve">Configuration and secrets are kept outside the code.</w:t>
       </w:r>
     </w:p>
     <w:p>
@@ -3637,11 +3212,11 @@
         <w:pStyle w:val="Compact"/>
         <w:numPr>
           <w:ilvl w:val="0"/>
-          <w:numId w:val="1005"/>
+          <w:numId w:val="1006"/>
         </w:numPr>
       </w:pPr>
       <w:r>
-        <w:t xml:space="preserve">The environment is defined in Terraform and can be recreated from code.</w:t>
+        <w:t xml:space="preserve">Health checks drive the deployment.</w:t>
       </w:r>
     </w:p>
     <w:p>
@@ -3649,11 +3224,11 @@
         <w:pStyle w:val="Compact"/>
         <w:numPr>
           <w:ilvl w:val="0"/>
-          <w:numId w:val="1005"/>
+          <w:numId w:val="1006"/>
         </w:numPr>
       </w:pPr>
       <w:r>
-        <w:t xml:space="preserve">Health checks drive the deployment.</w:t>
+        <w:t xml:space="preserve">Workers are disposable: interrupted jobs are reconciled rather than lost.</w:t>
       </w:r>
     </w:p>
     <w:p>
@@ -3661,19 +3236,7 @@
         <w:pStyle w:val="Compact"/>
         <w:numPr>
           <w:ilvl w:val="0"/>
-          <w:numId w:val="1005"/>
-        </w:numPr>
-      </w:pPr>
-      <w:r>
-        <w:t xml:space="preserve">Workers are disposable: interrupted jobs are reconciled rather than lost.</w:t>
-      </w:r>
-    </w:p>
-    <w:p>
-      <w:pPr>
-        <w:pStyle w:val="Compact"/>
-        <w:numPr>
-          <w:ilvl w:val="0"/>
-          <w:numId w:val="1005"/>
+          <w:numId w:val="1006"/>
         </w:numPr>
       </w:pPr>
       <w:r>
@@ -3697,7 +3260,7 @@
         <w:pStyle w:val="Compact"/>
         <w:numPr>
           <w:ilvl w:val="0"/>
-          <w:numId w:val="1006"/>
+          <w:numId w:val="1007"/>
         </w:numPr>
       </w:pPr>
       <w:r>
@@ -3709,7 +3272,7 @@
         <w:pStyle w:val="Compact"/>
         <w:numPr>
           <w:ilvl w:val="0"/>
-          <w:numId w:val="1006"/>
+          <w:numId w:val="1007"/>
         </w:numPr>
       </w:pPr>
       <w:r>
@@ -3721,7 +3284,7 @@
         <w:pStyle w:val="Compact"/>
         <w:numPr>
           <w:ilvl w:val="0"/>
-          <w:numId w:val="1006"/>
+          <w:numId w:val="1007"/>
         </w:numPr>
       </w:pPr>
       <w:r>
@@ -3733,7 +3296,7 @@
         <w:pStyle w:val="Compact"/>
         <w:numPr>
           <w:ilvl w:val="0"/>
-          <w:numId w:val="1006"/>
+          <w:numId w:val="1007"/>
         </w:numPr>
       </w:pPr>
       <w:r>
@@ -3770,11 +3333,11 @@
         <w:pStyle w:val="Compact"/>
         <w:numPr>
           <w:ilvl w:val="0"/>
-          <w:numId w:val="1007"/>
+          <w:numId w:val="1008"/>
         </w:numPr>
       </w:pPr>
       <w:r>
-        <w:t xml:space="preserve">GitHub Actions runs lint and unit tests (Ruff, pytest, Vitest), SonarCloud static analysis (SAST), contract and integration tests for both services, image builds tagged with the commit SHA, and a Trivy image scan.</w:t>
+        <w:t xml:space="preserve">We extend the existing GitHub Actions pipeline, which already runs linting, unit and integration tests, static analysis (SonarCloud), an image scan (Trivy) and a dynamic scan (OWASP ZAP), to cover both services and add contract tests.</w:t>
       </w:r>
     </w:p>
     <w:p>
@@ -3782,11 +3345,11 @@
         <w:pStyle w:val="Compact"/>
         <w:numPr>
           <w:ilvl w:val="0"/>
-          <w:numId w:val="1007"/>
+          <w:numId w:val="1008"/>
         </w:numPr>
       </w:pPr>
       <w:r>
-        <w:t xml:space="preserve">Failed tests and fixable HIGH or CRITICAL findings block the pipeline.</w:t>
+        <w:t xml:space="preserve">Failed tests and fixable HIGH or CRITICAL image findings block a release.</w:t>
       </w:r>
     </w:p>
     <w:p>
@@ -3794,11 +3357,11 @@
         <w:pStyle w:val="Compact"/>
         <w:numPr>
           <w:ilvl w:val="0"/>
-          <w:numId w:val="1007"/>
+          <w:numId w:val="1008"/>
         </w:numPr>
       </w:pPr>
       <w:r>
-        <w:t xml:space="preserve">A deploy script releases each service and checks its health, then the CLI runs an upload-to-playback smoke test.</w:t>
+        <w:t xml:space="preserve">A deploy step releases each service to AWS, then the CLI runs an upload-to-playback smoke test.</w:t>
       </w:r>
     </w:p>
     <w:p>
@@ -3806,31 +3369,7 @@
         <w:pStyle w:val="Compact"/>
         <w:numPr>
           <w:ilvl w:val="0"/>
-          <w:numId w:val="1007"/>
-        </w:numPr>
-      </w:pPr>
-      <w:r>
-        <w:t xml:space="preserve">An OWASP ZAP dynamic scan (DAST) runs weekly and after each deploy.</w:t>
-      </w:r>
-    </w:p>
-    <w:p>
-      <w:pPr>
-        <w:pStyle w:val="Compact"/>
-        <w:numPr>
-          <w:ilvl w:val="0"/>
-          <w:numId w:val="1007"/>
-        </w:numPr>
-      </w:pPr>
-      <w:r>
-        <w:t xml:space="preserve">Report-only findings receive a recorded disposition.</w:t>
-      </w:r>
-    </w:p>
-    <w:p>
-      <w:pPr>
-        <w:pStyle w:val="Compact"/>
-        <w:numPr>
-          <w:ilvl w:val="0"/>
-          <w:numId w:val="1007"/>
+          <w:numId w:val="1008"/>
         </w:numPr>
       </w:pPr>
       <w:r>
@@ -4007,18 +3546,18 @@
               <w:pStyle w:val="Compact"/>
             </w:pPr>
             <w:r>
-              <w:t xml:space="preserve">Presigned, time-limited S3 URLs; private buckets with Block Public Access; each service’s IAM role reaches only its own bucket</w:t>
-            </w:r>
-          </w:p>
-        </w:tc>
-        <w:tc>
-          <w:tcPr/>
-          <w:p>
-            <w:pPr>
-              <w:pStyle w:val="Compact"/>
-            </w:pPr>
-            <w:r>
-              <w:t xml:space="preserve">Expired and tampered URLs fail; no public bucket listing; each role is denied on the other bucket</w:t>
+              <w:t xml:space="preserve">Presigned, time-limited storage URLs; private storage</w:t>
+            </w:r>
+          </w:p>
+        </w:tc>
+        <w:tc>
+          <w:tcPr/>
+          <w:p>
+            <w:pPr>
+              <w:pStyle w:val="Compact"/>
+            </w:pPr>
+            <w:r>
+              <w:t xml:space="preserve">Expired and tampered URLs fail; no public listing of stored files</w:t>
             </w:r>
           </w:p>
         </w:tc>
@@ -4055,42 +3594,42 @@
               <w:pStyle w:val="Compact"/>
             </w:pPr>
             <w:r>
-              <w:t xml:space="preserve">Security groups expose only 443 (and 80 for certificate renewal); RDS accepts connections only from the EC2 security group; no SSH</w:t>
-            </w:r>
-          </w:p>
-        </w:tc>
-        <w:tc>
-          <w:tcPr/>
-          <w:p>
-            <w:pPr>
-              <w:pStyle w:val="Compact"/>
-            </w:pPr>
-            <w:r>
-              <w:t xml:space="preserve">External port scan; RDS unreachable from the internet</w:t>
-            </w:r>
-          </w:p>
-        </w:tc>
-      </w:tr>
-      <w:tr>
-        <w:tc>
-          <w:tcPr/>
-          <w:p>
-            <w:pPr>
-              <w:pStyle w:val="Compact"/>
-            </w:pPr>
-            <w:r>
-              <w:t xml:space="preserve">Secrets in SSM Parameter Store; GitHub Actions uses short-lived OIDC credentials</w:t>
-            </w:r>
-          </w:p>
-        </w:tc>
-        <w:tc>
-          <w:tcPr/>
-          <w:p>
-            <w:pPr>
-              <w:pStyle w:val="Compact"/>
-            </w:pPr>
-            <w:r>
-              <w:t xml:space="preserve">No secrets in git or images (secret scanning in CI); no long-lived AWS keys exist</w:t>
+              <w:t xml:space="preserve">Only HTTPS is public; databases, queue and storage are private</w:t>
+            </w:r>
+          </w:p>
+        </w:tc>
+        <w:tc>
+          <w:tcPr/>
+          <w:p>
+            <w:pPr>
+              <w:pStyle w:val="Compact"/>
+            </w:pPr>
+            <w:r>
+              <w:t xml:space="preserve">External port scan</w:t>
+            </w:r>
+          </w:p>
+        </w:tc>
+      </w:tr>
+      <w:tr>
+        <w:tc>
+          <w:tcPr/>
+          <w:p>
+            <w:pPr>
+              <w:pStyle w:val="Compact"/>
+            </w:pPr>
+            <w:r>
+              <w:t xml:space="preserve">Secrets kept out of git and images</w:t>
+            </w:r>
+          </w:p>
+        </w:tc>
+        <w:tc>
+          <w:tcPr/>
+          <w:p>
+            <w:pPr>
+              <w:pStyle w:val="Compact"/>
+            </w:pPr>
+            <w:r>
+              <w:t xml:space="preserve">Secret scanning in the pipeline</w:t>
             </w:r>
           </w:p>
         </w:tc>
@@ -4119,7 +3658,7 @@
         <w:pStyle w:val="Compact"/>
         <w:numPr>
           <w:ilvl w:val="0"/>
-          <w:numId w:val="1008"/>
+          <w:numId w:val="1009"/>
         </w:numPr>
       </w:pPr>
       <w:r>
@@ -4131,7 +3670,7 @@
         <w:pStyle w:val="Compact"/>
         <w:numPr>
           <w:ilvl w:val="0"/>
-          <w:numId w:val="1008"/>
+          <w:numId w:val="1009"/>
         </w:numPr>
       </w:pPr>
       <w:r>
@@ -4143,7 +3682,7 @@
         <w:pStyle w:val="Compact"/>
         <w:numPr>
           <w:ilvl w:val="0"/>
-          <w:numId w:val="1008"/>
+          <w:numId w:val="1009"/>
         </w:numPr>
       </w:pPr>
       <w:r>
@@ -4544,7 +4083,7 @@
         <w:pStyle w:val="Compact"/>
         <w:numPr>
           <w:ilvl w:val="0"/>
-          <w:numId w:val="1009"/>
+          <w:numId w:val="1010"/>
         </w:numPr>
       </w:pPr>
       <w:r>
@@ -4556,7 +4095,7 @@
         <w:pStyle w:val="Compact"/>
         <w:numPr>
           <w:ilvl w:val="0"/>
-          <w:numId w:val="1009"/>
+          <w:numId w:val="1010"/>
         </w:numPr>
       </w:pPr>
       <w:r>
@@ -4568,7 +4107,7 @@
         <w:pStyle w:val="Compact"/>
         <w:numPr>
           <w:ilvl w:val="0"/>
-          <w:numId w:val="1009"/>
+          <w:numId w:val="1010"/>
         </w:numPr>
       </w:pPr>
       <w:r>
@@ -4580,11 +4119,11 @@
         <w:pStyle w:val="Compact"/>
         <w:numPr>
           <w:ilvl w:val="0"/>
-          <w:numId w:val="1009"/>
+          <w:numId w:val="1010"/>
         </w:numPr>
       </w:pPr>
       <w:r>
-        <w:t xml:space="preserve">Kubernetes (EKS), ECS/Fargate, Auto Scaling groups, and multi-AZ or multi-region failover.</w:t>
+        <w:t xml:space="preserve">Kubernetes, autoscaling, and multi-zone or multi-region failover.</w:t>
       </w:r>
     </w:p>
     <w:p>
@@ -4592,7 +4131,7 @@
         <w:pStyle w:val="Compact"/>
         <w:numPr>
           <w:ilvl w:val="0"/>
-          <w:numId w:val="1009"/>
+          <w:numId w:val="1010"/>
         </w:numPr>
       </w:pPr>
       <w:r>
@@ -4786,7 +4325,7 @@
               <w:pStyle w:val="Compact"/>
             </w:pPr>
             <w:r>
-              <w:t xml:space="preserve">Independent release and scaling, disposable workers with recoverable state, managed AWS data services, infrastructure as code, and automated, gated delivery (§2.5, §3.3)</w:t>
+              <w:t xml:space="preserve">Independent release and scaling, disposable workers with recoverable state, and automated, gated delivery (§2.5, §3.3)</w:t>
             </w:r>
           </w:p>
         </w:tc>
@@ -4948,23 +4487,23 @@
               <w:jc w:val="right"/>
             </w:pPr>
             <w:r>
-              <w:t xml:space="preserve">1</w:t>
-            </w:r>
-          </w:p>
-        </w:tc>
-      </w:tr>
-      <w:tr>
-        <w:tc>
-          <w:tcPr/>
-          <w:p>
-            <w:pPr>
-              <w:pStyle w:val="Compact"/>
-            </w:pPr>
-            <w:r>
               <w:t xml:space="preserve">2</w:t>
             </w:r>
           </w:p>
         </w:tc>
+      </w:tr>
+      <w:tr>
+        <w:tc>
+          <w:tcPr/>
+          <w:p>
+            <w:pPr>
+              <w:pStyle w:val="Compact"/>
+            </w:pPr>
+            <w:r>
+              <w:t xml:space="preserve">2</w:t>
+            </w:r>
+          </w:p>
+        </w:tc>
         <w:tc>
           <w:tcPr/>
           <w:p>
@@ -5207,7 +4746,7 @@
               <w:pStyle w:val="Compact"/>
             </w:pPr>
             <w:r>
-              <w:t xml:space="preserve">AWS environment in Terraform (VPC, EC2, RDS, S3, ECR, IAM), OIDC deploy role, per-service deployment, pipeline adaptation, smoke test</w:t>
+              <w:t xml:space="preserve">AWS environment, per-service deployment, pipeline updates, smoke test</w:t>
             </w:r>
           </w:p>
         </w:tc>
@@ -5230,7 +4769,7 @@
               <w:jc w:val="right"/>
             </w:pPr>
             <w:r>
-              <w:t xml:space="preserve">5</w:t>
+              <w:t xml:space="preserve">4</w:t>
             </w:r>
           </w:p>
         </w:tc>
@@ -5754,29 +5293,29 @@
               <w:pStyle w:val="Compact"/>
             </w:pPr>
             <w:r>
-              <w:t xml:space="preserve">AWS account limits or cost overrun</w:t>
-            </w:r>
-          </w:p>
-        </w:tc>
-        <w:tc>
-          <w:tcPr/>
-          <w:p>
-            <w:pPr>
-              <w:pStyle w:val="Compact"/>
-            </w:pPr>
-            <w:r>
-              <w:t xml:space="preserve">Late experiments or blocked environment</w:t>
-            </w:r>
-          </w:p>
-        </w:tc>
-        <w:tc>
-          <w:tcPr/>
-          <w:p>
-            <w:pPr>
-              <w:pStyle w:val="Compact"/>
-            </w:pPr>
-            <w:r>
-              <w:t xml:space="preserve">Provision with Terraform in week 1 and check the vCPU quota early; budget alerts; stop instances when idle; identical Compose stack runs locally</w:t>
+              <w:t xml:space="preserve">AWS account or cost issues</w:t>
+            </w:r>
+          </w:p>
+        </w:tc>
+        <w:tc>
+          <w:tcPr/>
+          <w:p>
+            <w:pPr>
+              <w:pStyle w:val="Compact"/>
+            </w:pPr>
+            <w:r>
+              <w:t xml:space="preserve">Late experiments</w:t>
+            </w:r>
+          </w:p>
+        </w:tc>
+        <w:tc>
+          <w:tcPr/>
+          <w:p>
+            <w:pPr>
+              <w:pStyle w:val="Compact"/>
+            </w:pPr>
+            <w:r>
+              <w:t xml:space="preserve">Set up the AWS account in week 1; cost alerts; the same stack runs locally</w:t>
             </w:r>
           </w:p>
         </w:tc>
@@ -5867,11 +5406,11 @@
         <w:pStyle w:val="Compact"/>
         <w:numPr>
           <w:ilvl w:val="0"/>
-          <w:numId w:val="1010"/>
+          <w:numId w:val="1011"/>
         </w:numPr>
       </w:pPr>
       <w:r>
-        <w:t xml:space="preserve">The team has an AWS account with enough EC2 vCPU quota in ap-southeast-1 by week 1.</w:t>
+        <w:t xml:space="preserve">The team has an AWS account ready in week 1.</w:t>
       </w:r>
     </w:p>
     <w:p>
@@ -5879,7 +5418,7 @@
         <w:pStyle w:val="Compact"/>
         <w:numPr>
           <w:ilvl w:val="0"/>
-          <w:numId w:val="1010"/>
+          <w:numId w:val="1011"/>
         </w:numPr>
       </w:pPr>
       <w:r>
@@ -5891,7 +5430,7 @@
         <w:pStyle w:val="Compact"/>
         <w:numPr>
           <w:ilvl w:val="0"/>
-          <w:numId w:val="1010"/>
+          <w:numId w:val="1011"/>
         </w:numPr>
       </w:pPr>
       <w:r>
@@ -6257,6 +5796,9 @@
     <w:abstractNumId w:val="991"/>
   </w:num>
   <w:num w:numId="1010">
+    <w:abstractNumId w:val="991"/>
+  </w:num>
+  <w:num w:numId="1011">
     <w:abstractNumId w:val="991"/>
   </w:num>
 </w:numbering>

</xml_diff>